<commit_message>
Refine recruiter navigation and update application documents
Add role and work-arrangement preferences, a recruiter overview and a professional cover letter. Clarify internships and industrial attachments in the CV and profile.
</commit_message>
<xml_diff>
--- a/Tony_Waiguru_CV.docx
+++ b/Tony_Waiguru_CV.docx
@@ -82,7 +82,7 @@
     </w:p>
     <w:p>
       <w:r>
-        <w:t>Python backend developer with a telecommunications engineering background and independent projects spanning real-time event processing, account orchestration, transaction reconciliation, and trading software. Built Python/Rust services and a TypeScript trading workspace, with emphasis on concurrency, durable state, API integration, and failure recovery. Earlier roles at KBC, KCAA, and Heaven Bound TV developed practical troubleshooting experience across broadcast, aviation communications, and IT networks.</w:t>
+        <w:t>Python backend developer building real-time services, automation, and fintech tools. Independent projects combine Python/Rust event processing, durable transaction workflows, and TypeScript product interfaces, with emphasis on concurrency, API integration, and failure recovery. A telecommunications engineering diploma and internships/attachments at KBC, KCAA, and Heaven Bound TV provide a practical foundation in systems troubleshooting.</w:t>
       </w:r>
     </w:p>
     <w:p>
@@ -446,7 +446,7 @@
         <w:rPr>
           <w:b/>
         </w:rPr>
-        <w:t>Telecommunications Technician | Kenya Broadcasting Corporation (KBC)</w:t>
+        <w:t>Telecommunications Technician Intern | Kenya Broadcasting Corporation (KBC)</w:t>
       </w:r>
     </w:p>
     <w:p>
@@ -480,7 +480,7 @@
         <w:rPr>
           <w:b/>
         </w:rPr>
-        <w:t>Aeronautical Telecommunications Officer | Kenya Civil Aviation Authority (KCAA)</w:t>
+        <w:t>Aeronautical Telecommunications Attaché | Kenya Civil Aviation Authority (KCAA)</w:t>
       </w:r>
     </w:p>
     <w:p>
@@ -514,7 +514,7 @@
         <w:rPr>
           <w:b/>
         </w:rPr>
-        <w:t>Broadcast Technician | Heaven Bound TV</w:t>
+        <w:t>Broadcast Technician Attaché | Heaven Bound TV</w:t>
       </w:r>
     </w:p>
     <w:p>

</xml_diff>